<commit_message>
Finalize CAR module: workflow, admin inbox, publish integration, and edit support in document viewer
</commit_message>
<xml_diff>
--- a/templates/F-QMS-006 Corrective Action Request Rev.1 02-02-26_Template.docx
+++ b/templates/F-QMS-006 Corrective Action Request Rev.1 02-02-26_Template.docx
@@ -27,12 +27,6 @@
         <w:gridCol w:w="10596"/>
       </w:tblGrid>
       <w:tr>
-        <w:tblPrEx>
-          <w:tblCellMar>
-            <w:top w:w="0" w:type="dxa"/>
-            <w:bottom w:w="0" w:type="dxa"/>
-          </w:tblCellMar>
-        </w:tblPrEx>
         <w:trPr>
           <w:trHeight w:val="1368"/>
         </w:trPr>
@@ -91,7 +85,7 @@
                               <v:path o:extrusionok="f" gradientshapeok="t" o:connecttype="rect"/>
                               <o:lock v:ext="edit" aspectratio="t"/>
                             </v:shapetype>
-                            <v:shape id="_x0000_i1025" type="#_x0000_t75" style="width:40.5pt;height:40.5pt">
+                            <v:shape id="_x0000_i1026" type="#_x0000_t75" style="width:40.5pt;height:40.5pt">
                               <v:imagedata r:id="rId8" o:title="LNU LOGO"/>
                             </v:shape>
                           </w:pict>
@@ -172,10 +166,6 @@
             <w:insideH w:val="single" w:sz="6" w:space="0" w:color="auto"/>
             <w:insideV w:val="single" w:sz="6" w:space="0" w:color="auto"/>
           </w:tblBorders>
-          <w:tblCellMar>
-            <w:top w:w="0" w:type="dxa"/>
-            <w:bottom w:w="0" w:type="dxa"/>
-          </w:tblCellMar>
         </w:tblPrEx>
         <w:trPr>
           <w:trHeight w:val="1682"/>
@@ -269,107 +259,91 @@
                     <w:rPr>
                       <w:rFonts w:ascii="Arial" w:hAnsi="Arial" w:cs="Arial"/>
                     </w:rPr>
+                    <w:t>${deptSection}</w:t>
+                  </w:r>
+                </w:p>
+              </w:tc>
+              <w:tc>
+                <w:tcPr>
+                  <w:tcW w:w="819" w:type="dxa"/>
+                  <w:noWrap/>
+                  <w:vAlign w:val="bottom"/>
+                </w:tcPr>
+                <w:p>
+                  <w:pPr>
+                    <w:rPr>
+                      <w:rFonts w:ascii="Arial" w:hAnsi="Arial" w:cs="Arial"/>
+                    </w:rPr>
+                  </w:pPr>
+                </w:p>
+              </w:tc>
+              <w:tc>
+                <w:tcPr>
+                  <w:tcW w:w="1457" w:type="dxa"/>
+                  <w:noWrap/>
+                  <w:vAlign w:val="bottom"/>
+                </w:tcPr>
+                <w:p>
+                  <w:pPr>
+                    <w:rPr>
+                      <w:rFonts w:ascii="Arial" w:hAnsi="Arial" w:cs="Arial"/>
+                    </w:rPr>
+                  </w:pPr>
+                  <w:r>
+                    <w:rPr>
+                      <w:rFonts w:ascii="Arial" w:hAnsi="Arial" w:cs="Arial"/>
+                    </w:rPr>
+                    <w:t>Ref. No.</w:t>
+                  </w:r>
+                </w:p>
+              </w:tc>
+              <w:tc>
+                <w:tcPr>
+                  <w:tcW w:w="272" w:type="dxa"/>
+                  <w:noWrap/>
+                  <w:vAlign w:val="bottom"/>
+                </w:tcPr>
+                <w:p>
+                  <w:pPr>
+                    <w:rPr>
+                      <w:rFonts w:ascii="Arial" w:hAnsi="Arial" w:cs="Arial"/>
+                    </w:rPr>
+                  </w:pPr>
+                  <w:r>
+                    <w:rPr>
+                      <w:rFonts w:ascii="Arial" w:hAnsi="Arial" w:cs="Arial"/>
+                    </w:rPr>
+                    <w:t>:</w:t>
+                  </w:r>
+                </w:p>
+              </w:tc>
+              <w:tc>
+                <w:tcPr>
+                  <w:tcW w:w="2100" w:type="dxa"/>
+                  <w:tcBorders>
+                    <w:bottom w:val="single" w:sz="4" w:space="0" w:color="auto"/>
+                  </w:tcBorders>
+                  <w:noWrap/>
+                  <w:vAlign w:val="bottom"/>
+                </w:tcPr>
+                <w:p>
+                  <w:pPr>
+                    <w:rPr>
+                      <w:rFonts w:ascii="Arial" w:hAnsi="Arial" w:cs="Arial"/>
+                    </w:rPr>
+                  </w:pPr>
+                  <w:r>
+                    <w:rPr>
+                      <w:rFonts w:ascii="Arial" w:hAnsi="Arial" w:cs="Arial"/>
+                    </w:rPr>
                     <w:t>${</w:t>
                   </w:r>
-                  <w:proofErr w:type="spellStart"/>
-                  <w:r>
-                    <w:rPr>
-                      <w:rFonts w:ascii="Arial" w:hAnsi="Arial" w:cs="Arial"/>
-                    </w:rPr>
-                    <w:t>deptSection</w:t>
-                  </w:r>
-                  <w:proofErr w:type="spellEnd"/>
-                  <w:r>
-                    <w:rPr>
-                      <w:rFonts w:ascii="Arial" w:hAnsi="Arial" w:cs="Arial"/>
-                    </w:rPr>
-                    <w:t>}</w:t>
-                  </w:r>
-                </w:p>
-              </w:tc>
-              <w:tc>
-                <w:tcPr>
-                  <w:tcW w:w="819" w:type="dxa"/>
-                  <w:noWrap/>
-                  <w:vAlign w:val="bottom"/>
-                </w:tcPr>
-                <w:p>
-                  <w:pPr>
-                    <w:rPr>
-                      <w:rFonts w:ascii="Arial" w:hAnsi="Arial" w:cs="Arial"/>
-                    </w:rPr>
-                  </w:pPr>
-                </w:p>
-              </w:tc>
-              <w:tc>
-                <w:tcPr>
-                  <w:tcW w:w="1457" w:type="dxa"/>
-                  <w:noWrap/>
-                  <w:vAlign w:val="bottom"/>
-                </w:tcPr>
-                <w:p>
-                  <w:pPr>
-                    <w:rPr>
-                      <w:rFonts w:ascii="Arial" w:hAnsi="Arial" w:cs="Arial"/>
-                    </w:rPr>
-                  </w:pPr>
-                  <w:r>
-                    <w:rPr>
-                      <w:rFonts w:ascii="Arial" w:hAnsi="Arial" w:cs="Arial"/>
-                    </w:rPr>
-                    <w:t>Ref. No.</w:t>
-                  </w:r>
-                </w:p>
-              </w:tc>
-              <w:tc>
-                <w:tcPr>
-                  <w:tcW w:w="272" w:type="dxa"/>
-                  <w:noWrap/>
-                  <w:vAlign w:val="bottom"/>
-                </w:tcPr>
-                <w:p>
-                  <w:pPr>
-                    <w:rPr>
-                      <w:rFonts w:ascii="Arial" w:hAnsi="Arial" w:cs="Arial"/>
-                    </w:rPr>
-                  </w:pPr>
-                  <w:r>
-                    <w:rPr>
-                      <w:rFonts w:ascii="Arial" w:hAnsi="Arial" w:cs="Arial"/>
-                    </w:rPr>
-                    <w:t>:</w:t>
-                  </w:r>
-                </w:p>
-              </w:tc>
-              <w:tc>
-                <w:tcPr>
-                  <w:tcW w:w="2100" w:type="dxa"/>
-                  <w:tcBorders>
-                    <w:bottom w:val="single" w:sz="4" w:space="0" w:color="auto"/>
-                  </w:tcBorders>
-                  <w:noWrap/>
-                  <w:vAlign w:val="bottom"/>
-                </w:tcPr>
-                <w:p>
-                  <w:pPr>
-                    <w:rPr>
-                      <w:rFonts w:ascii="Arial" w:hAnsi="Arial" w:cs="Arial"/>
-                    </w:rPr>
-                  </w:pPr>
-                  <w:r>
-                    <w:rPr>
-                      <w:rFonts w:ascii="Arial" w:hAnsi="Arial" w:cs="Arial"/>
-                    </w:rPr>
-                    <w:t>${</w:t>
-                  </w:r>
-                  <w:proofErr w:type="spellStart"/>
                   <w:r>
                     <w:rPr>
                       <w:rFonts w:ascii="Arial" w:hAnsi="Arial" w:cs="Arial"/>
                     </w:rPr>
                     <w:t>refNo</w:t>
                   </w:r>
-                  <w:proofErr w:type="spellEnd"/>
                   <w:r>
                     <w:rPr>
                       <w:rFonts w:ascii="Arial" w:hAnsi="Arial" w:cs="Arial"/>
@@ -536,14 +510,12 @@
                     </w:rPr>
                     <w:t>${</w:t>
                   </w:r>
-                  <w:proofErr w:type="spellStart"/>
                   <w:r>
                     <w:rPr>
                       <w:rFonts w:ascii="Arial" w:hAnsi="Arial" w:cs="Arial"/>
                     </w:rPr>
                     <w:t>carNo</w:t>
                   </w:r>
-                  <w:proofErr w:type="spellEnd"/>
                   <w:r>
                     <w:rPr>
                       <w:rFonts w:ascii="Arial" w:hAnsi="Arial" w:cs="Arial"/>
@@ -619,14 +591,12 @@
                     </w:rPr>
                     <w:t>${</w:t>
                   </w:r>
-                  <w:proofErr w:type="spellStart"/>
                   <w:r>
                     <w:rPr>
                       <w:rFonts w:ascii="Arial" w:hAnsi="Arial" w:cs="Arial"/>
                     </w:rPr>
                     <w:t>dateRep</w:t>
                   </w:r>
-                  <w:proofErr w:type="spellEnd"/>
                   <w:r>
                     <w:rPr>
                       <w:rFonts w:ascii="Arial" w:hAnsi="Arial" w:cs="Arial"/>
@@ -711,14 +681,12 @@
                     </w:rPr>
                     <w:t>${</w:t>
                   </w:r>
-                  <w:proofErr w:type="spellStart"/>
                   <w:r>
                     <w:rPr>
                       <w:rFonts w:ascii="Arial" w:hAnsi="Arial" w:cs="Arial"/>
                     </w:rPr>
                     <w:t>isoClause</w:t>
                   </w:r>
-                  <w:proofErr w:type="spellEnd"/>
                   <w:r>
                     <w:rPr>
                       <w:rFonts w:ascii="Arial" w:hAnsi="Arial" w:cs="Arial"/>
@@ -829,14 +797,24 @@
                     </w:rPr>
                     <w:t>${</w:t>
                   </w:r>
-                  <w:proofErr w:type="spellStart"/>
-                  <w:r>
-                    <w:rPr>
-                      <w:rFonts w:ascii="Arial" w:hAnsi="Arial" w:cs="Arial"/>
-                    </w:rPr>
-                    <w:t>nonConform</w:t>
-                  </w:r>
-                  <w:proofErr w:type="spellEnd"/>
+                  <w:r>
+                    <w:rPr>
+                      <w:rFonts w:ascii="Arial" w:hAnsi="Arial" w:cs="Arial"/>
+                    </w:rPr>
+                    <w:t>nonCon</w:t>
+                  </w:r>
+                  <w:r>
+                    <w:rPr>
+                      <w:rFonts w:ascii="Arial" w:hAnsi="Arial" w:cs="Arial"/>
+                    </w:rPr>
+                    <w:t>F</w:t>
+                  </w:r>
+                  <w:r>
+                    <w:rPr>
+                      <w:rFonts w:ascii="Arial" w:hAnsi="Arial" w:cs="Arial"/>
+                    </w:rPr>
+                    <w:t>orm</w:t>
+                  </w:r>
                   <w:r>
                     <w:rPr>
                       <w:rFonts w:ascii="Arial" w:hAnsi="Arial" w:cs="Arial"/>
@@ -880,10 +858,6 @@
             <w:insideH w:val="single" w:sz="6" w:space="0" w:color="auto"/>
             <w:insideV w:val="single" w:sz="6" w:space="0" w:color="auto"/>
           </w:tblBorders>
-          <w:tblCellMar>
-            <w:top w:w="0" w:type="dxa"/>
-            <w:bottom w:w="0" w:type="dxa"/>
-          </w:tblCellMar>
         </w:tblPrEx>
         <w:trPr>
           <w:trHeight w:val="4917"/>
@@ -1100,14 +1074,12 @@
               </w:rPr>
               <w:t>${</w:t>
             </w:r>
-            <w:proofErr w:type="spellStart"/>
             <w:r>
               <w:rPr>
                 <w:rFonts w:ascii="Arial" w:hAnsi="Arial" w:cs="Arial"/>
               </w:rPr>
               <w:t>conseq</w:t>
             </w:r>
-            <w:proofErr w:type="spellEnd"/>
             <w:r>
               <w:rPr>
                 <w:rFonts w:ascii="Arial" w:hAnsi="Arial" w:cs="Arial"/>
@@ -1201,14 +1173,12 @@
                     </w:rPr>
                     <w:t>${</w:t>
                   </w:r>
-                  <w:proofErr w:type="spellStart"/>
                   <w:r>
                     <w:rPr>
                       <w:rFonts w:ascii="Arial" w:hAnsi="Arial" w:cs="Arial"/>
                     </w:rPr>
                     <w:t>depRep</w:t>
                   </w:r>
-                  <w:proofErr w:type="spellEnd"/>
                   <w:r>
                     <w:rPr>
                       <w:rFonts w:ascii="Arial" w:hAnsi="Arial" w:cs="Arial"/>
@@ -1263,14 +1233,12 @@
                     </w:rPr>
                     <w:t>${</w:t>
                   </w:r>
-                  <w:proofErr w:type="spellStart"/>
                   <w:r>
                     <w:rPr>
                       <w:rFonts w:ascii="Arial" w:hAnsi="Arial" w:cs="Arial"/>
                     </w:rPr>
                     <w:t>sigAuditor</w:t>
                   </w:r>
-                  <w:proofErr w:type="spellEnd"/>
                   <w:r>
                     <w:rPr>
                       <w:rFonts w:ascii="Arial" w:hAnsi="Arial" w:cs="Arial"/>
@@ -1324,14 +1292,12 @@
                     </w:rPr>
                     <w:t>${</w:t>
                   </w:r>
-                  <w:proofErr w:type="spellStart"/>
                   <w:r>
                     <w:rPr>
                       <w:rFonts w:ascii="Arial" w:hAnsi="Arial" w:cs="Arial"/>
                     </w:rPr>
                     <w:t>agreedDate</w:t>
                   </w:r>
-                  <w:proofErr w:type="spellEnd"/>
                   <w:r>
                     <w:rPr>
                       <w:rFonts w:ascii="Arial" w:hAnsi="Arial" w:cs="Arial"/>
@@ -1652,10 +1618,6 @@
             <w:insideH w:val="single" w:sz="6" w:space="0" w:color="auto"/>
             <w:insideV w:val="single" w:sz="6" w:space="0" w:color="auto"/>
           </w:tblBorders>
-          <w:tblCellMar>
-            <w:top w:w="0" w:type="dxa"/>
-            <w:bottom w:w="0" w:type="dxa"/>
-          </w:tblCellMar>
         </w:tblPrEx>
         <w:trPr>
           <w:trHeight w:val="1517"/>
@@ -1810,21 +1772,7 @@
                     <w:rPr>
                       <w:rFonts w:ascii="Arial" w:hAnsi="Arial" w:cs="Arial"/>
                     </w:rPr>
-                    <w:t>${</w:t>
-                  </w:r>
-                  <w:proofErr w:type="spellStart"/>
-                  <w:r>
-                    <w:rPr>
-                      <w:rFonts w:ascii="Arial" w:hAnsi="Arial" w:cs="Arial"/>
-                    </w:rPr>
-                    <w:t>actualdate</w:t>
-                  </w:r>
-                  <w:proofErr w:type="spellEnd"/>
-                  <w:r>
-                    <w:rPr>
-                      <w:rFonts w:ascii="Arial" w:hAnsi="Arial" w:cs="Arial"/>
-                    </w:rPr>
-                    <w:t>}</w:t>
+                    <w:t>${actualdate}</w:t>
                   </w:r>
                 </w:p>
               </w:tc>
@@ -1902,21 +1850,7 @@
                     <w:rPr>
                       <w:rFonts w:ascii="Arial" w:hAnsi="Arial" w:cs="Arial"/>
                     </w:rPr>
-                    <w:t>${</w:t>
-                  </w:r>
-                  <w:proofErr w:type="spellStart"/>
-                  <w:r>
-                    <w:rPr>
-                      <w:rFonts w:ascii="Arial" w:hAnsi="Arial" w:cs="Arial"/>
-                    </w:rPr>
-                    <w:t>notedby</w:t>
-                  </w:r>
-                  <w:proofErr w:type="spellEnd"/>
-                  <w:r>
-                    <w:rPr>
-                      <w:rFonts w:ascii="Arial" w:hAnsi="Arial" w:cs="Arial"/>
-                    </w:rPr>
-                    <w:t>}</w:t>
+                    <w:t>${notedby}</w:t>
                   </w:r>
                 </w:p>
               </w:tc>
@@ -1962,10 +1896,6 @@
             <w:insideH w:val="single" w:sz="6" w:space="0" w:color="auto"/>
             <w:insideV w:val="single" w:sz="6" w:space="0" w:color="auto"/>
           </w:tblBorders>
-          <w:tblCellMar>
-            <w:top w:w="0" w:type="dxa"/>
-            <w:bottom w:w="0" w:type="dxa"/>
-          </w:tblCellMar>
         </w:tblPrEx>
         <w:trPr>
           <w:trHeight w:val="1798"/>
@@ -2023,14 +1953,12 @@
               </w:rPr>
               <w:t>${</w:t>
             </w:r>
-            <w:proofErr w:type="spellStart"/>
             <w:r>
               <w:rPr>
                 <w:rFonts w:ascii="Arial" w:hAnsi="Arial" w:cs="Arial"/>
               </w:rPr>
               <w:t>rootCause</w:t>
             </w:r>
-            <w:proofErr w:type="spellEnd"/>
             <w:r>
               <w:rPr>
                 <w:rFonts w:ascii="Arial" w:hAnsi="Arial" w:cs="Arial"/>
@@ -2137,14 +2065,12 @@
                     </w:rPr>
                     <w:t>${</w:t>
                   </w:r>
-                  <w:proofErr w:type="spellStart"/>
                   <w:r>
                     <w:rPr>
                       <w:rFonts w:ascii="Arial" w:hAnsi="Arial" w:cs="Arial"/>
                     </w:rPr>
                     <w:t>rootCauseBy</w:t>
                   </w:r>
-                  <w:proofErr w:type="spellEnd"/>
                   <w:r>
                     <w:rPr>
                       <w:rFonts w:ascii="Arial" w:hAnsi="Arial" w:cs="Arial"/>
@@ -2233,14 +2159,12 @@
                     </w:rPr>
                     <w:t>${</w:t>
                   </w:r>
-                  <w:proofErr w:type="spellStart"/>
                   <w:r>
                     <w:rPr>
                       <w:rFonts w:ascii="Arial" w:hAnsi="Arial" w:cs="Arial"/>
                     </w:rPr>
                     <w:t>rootCauseDate</w:t>
                   </w:r>
-                  <w:proofErr w:type="spellEnd"/>
                   <w:r>
                     <w:rPr>
                       <w:rFonts w:ascii="Arial" w:hAnsi="Arial" w:cs="Arial"/>
@@ -2326,21 +2250,7 @@
                     <w:rPr>
                       <w:rFonts w:ascii="Arial" w:hAnsi="Arial" w:cs="Arial"/>
                     </w:rPr>
-                    <w:t>${</w:t>
-                  </w:r>
-                  <w:proofErr w:type="spellStart"/>
-                  <w:r>
-                    <w:rPr>
-                      <w:rFonts w:ascii="Arial" w:hAnsi="Arial" w:cs="Arial"/>
-                    </w:rPr>
-                    <w:t>rootCauseNotedBy</w:t>
-                  </w:r>
-                  <w:proofErr w:type="spellEnd"/>
-                  <w:r>
-                    <w:rPr>
-                      <w:rFonts w:ascii="Arial" w:hAnsi="Arial" w:cs="Arial"/>
-                    </w:rPr>
-                    <w:t>}</w:t>
+                    <w:t>${rootCauseNotedBy}</w:t>
                   </w:r>
                 </w:p>
               </w:tc>
@@ -2421,21 +2331,7 @@
                     <w:rPr>
                       <w:rFonts w:ascii="Arial" w:hAnsi="Arial" w:cs="Arial"/>
                     </w:rPr>
-                    <w:t>${</w:t>
-                  </w:r>
-                  <w:proofErr w:type="spellStart"/>
-                  <w:r>
-                    <w:rPr>
-                      <w:rFonts w:ascii="Arial" w:hAnsi="Arial" w:cs="Arial"/>
-                    </w:rPr>
-                    <w:t>rootCauseNotedDate</w:t>
-                  </w:r>
-                  <w:proofErr w:type="spellEnd"/>
-                  <w:r>
-                    <w:rPr>
-                      <w:rFonts w:ascii="Arial" w:hAnsi="Arial" w:cs="Arial"/>
-                    </w:rPr>
-                    <w:t>}</w:t>
+                    <w:t>${rootCauseNotedDate}</w:t>
                   </w:r>
                 </w:p>
               </w:tc>
@@ -2465,10 +2361,6 @@
             <w:insideH w:val="single" w:sz="6" w:space="0" w:color="auto"/>
             <w:insideV w:val="single" w:sz="6" w:space="0" w:color="auto"/>
           </w:tblBorders>
-          <w:tblCellMar>
-            <w:top w:w="0" w:type="dxa"/>
-            <w:bottom w:w="0" w:type="dxa"/>
-          </w:tblCellMar>
         </w:tblPrEx>
         <w:trPr>
           <w:trHeight w:val="1517"/>
@@ -2571,22 +2463,14 @@
               <w:rPr>
                 <w:rFonts w:ascii="Arial" w:hAnsi="Arial" w:cs="Arial"/>
               </w:rPr>
-              <w:t>${</w:t>
-            </w:r>
-            <w:proofErr w:type="spellStart"/>
+              <w:t>${correctiveActio</w:t>
+            </w:r>
             <w:r>
               <w:rPr>
                 <w:rFonts w:ascii="Arial" w:hAnsi="Arial" w:cs="Arial"/>
               </w:rPr>
-              <w:t>correctiveActio</w:t>
-            </w:r>
-            <w:r>
-              <w:rPr>
-                <w:rFonts w:ascii="Arial" w:hAnsi="Arial" w:cs="Arial"/>
-              </w:rPr>
               <w:t>n</w:t>
             </w:r>
-            <w:proofErr w:type="spellEnd"/>
             <w:r>
               <w:rPr>
                 <w:rFonts w:ascii="Arial" w:hAnsi="Arial" w:cs="Arial"/>
@@ -2687,21 +2571,7 @@
                     <w:rPr>
                       <w:rFonts w:ascii="Arial" w:hAnsi="Arial" w:cs="Arial"/>
                     </w:rPr>
-                    <w:t>${</w:t>
-                  </w:r>
-                  <w:proofErr w:type="spellStart"/>
-                  <w:r>
-                    <w:rPr>
-                      <w:rFonts w:ascii="Arial" w:hAnsi="Arial" w:cs="Arial"/>
-                    </w:rPr>
-                    <w:t>correctiveActionDate</w:t>
-                  </w:r>
-                  <w:proofErr w:type="spellEnd"/>
-                  <w:r>
-                    <w:rPr>
-                      <w:rFonts w:ascii="Arial" w:hAnsi="Arial" w:cs="Arial"/>
-                    </w:rPr>
-                    <w:t>}</w:t>
+                    <w:t>${correctiveActionDate}</w:t>
                   </w:r>
                 </w:p>
               </w:tc>
@@ -2779,21 +2649,7 @@
                     <w:rPr>
                       <w:rFonts w:ascii="Arial" w:hAnsi="Arial" w:cs="Arial"/>
                     </w:rPr>
-                    <w:t>${</w:t>
-                  </w:r>
-                  <w:proofErr w:type="spellStart"/>
-                  <w:r>
-                    <w:rPr>
-                      <w:rFonts w:ascii="Arial" w:hAnsi="Arial" w:cs="Arial"/>
-                    </w:rPr>
-                    <w:t>correctiveActionNotedBy</w:t>
-                  </w:r>
-                  <w:proofErr w:type="spellEnd"/>
-                  <w:r>
-                    <w:rPr>
-                      <w:rFonts w:ascii="Arial" w:hAnsi="Arial" w:cs="Arial"/>
-                    </w:rPr>
-                    <w:t>}</w:t>
+                    <w:t>${correctiveActionNotedBy}</w:t>
                   </w:r>
                 </w:p>
               </w:tc>
@@ -2838,10 +2694,6 @@
             <w:insideH w:val="single" w:sz="6" w:space="0" w:color="auto"/>
             <w:insideV w:val="single" w:sz="6" w:space="0" w:color="auto"/>
           </w:tblBorders>
-          <w:tblCellMar>
-            <w:top w:w="0" w:type="dxa"/>
-            <w:bottom w:w="0" w:type="dxa"/>
-          </w:tblCellMar>
         </w:tblPrEx>
         <w:trPr>
           <w:trHeight w:val="1319"/>
@@ -2939,21 +2791,7 @@
                     <w:rPr>
                       <w:rFonts w:ascii="Arial" w:hAnsi="Arial" w:cs="Arial"/>
                     </w:rPr>
-                    <w:t>${</w:t>
-                  </w:r>
-                  <w:proofErr w:type="spellStart"/>
-                  <w:r>
-                    <w:rPr>
-                      <w:rFonts w:ascii="Arial" w:hAnsi="Arial" w:cs="Arial"/>
-                    </w:rPr>
-                    <w:t>riskNo</w:t>
-                  </w:r>
-                  <w:proofErr w:type="spellEnd"/>
-                  <w:r>
-                    <w:rPr>
-                      <w:rFonts w:ascii="Arial" w:hAnsi="Arial" w:cs="Arial"/>
-                    </w:rPr>
-                    <w:t>}</w:t>
+                    <w:t>${riskNo}</w:t>
                   </w:r>
                 </w:p>
               </w:tc>
@@ -3032,21 +2870,7 @@
                     <w:rPr>
                       <w:rFonts w:ascii="Arial" w:hAnsi="Arial" w:cs="Arial"/>
                     </w:rPr>
-                    <w:t>${</w:t>
-                  </w:r>
-                  <w:proofErr w:type="spellStart"/>
-                  <w:r>
-                    <w:rPr>
-                      <w:rFonts w:ascii="Arial" w:hAnsi="Arial" w:cs="Arial"/>
-                    </w:rPr>
-                    <w:t>riskYes</w:t>
-                  </w:r>
-                  <w:proofErr w:type="spellEnd"/>
-                  <w:r>
-                    <w:rPr>
-                      <w:rFonts w:ascii="Arial" w:hAnsi="Arial" w:cs="Arial"/>
-                    </w:rPr>
-                    <w:t>}</w:t>
+                    <w:t>${riskYes}</w:t>
                   </w:r>
                 </w:p>
               </w:tc>
@@ -3129,21 +2953,7 @@
                     <w:rPr>
                       <w:rFonts w:ascii="Arial" w:hAnsi="Arial" w:cs="Arial"/>
                     </w:rPr>
-                    <w:t>${</w:t>
-                  </w:r>
-                  <w:proofErr w:type="spellStart"/>
-                  <w:r>
-                    <w:rPr>
-                      <w:rFonts w:ascii="Arial" w:hAnsi="Arial" w:cs="Arial"/>
-                    </w:rPr>
-                    <w:t>riskDateUpdated</w:t>
-                  </w:r>
-                  <w:proofErr w:type="spellEnd"/>
-                  <w:r>
-                    <w:rPr>
-                      <w:rFonts w:ascii="Arial" w:hAnsi="Arial" w:cs="Arial"/>
-                    </w:rPr>
-                    <w:t>}</w:t>
+                    <w:t>${riskDateUpdated}</w:t>
                   </w:r>
                 </w:p>
               </w:tc>
@@ -3199,21 +3009,7 @@
                     <w:rPr>
                       <w:rFonts w:ascii="Arial" w:hAnsi="Arial" w:cs="Arial"/>
                     </w:rPr>
-                    <w:t>${</w:t>
-                  </w:r>
-                  <w:proofErr w:type="spellStart"/>
-                  <w:r>
-                    <w:rPr>
-                      <w:rFonts w:ascii="Arial" w:hAnsi="Arial" w:cs="Arial"/>
-                    </w:rPr>
-                    <w:t>riskVerifiedBy</w:t>
-                  </w:r>
-                  <w:proofErr w:type="spellEnd"/>
-                  <w:r>
-                    <w:rPr>
-                      <w:rFonts w:ascii="Arial" w:hAnsi="Arial" w:cs="Arial"/>
-                    </w:rPr>
-                    <w:t>}</w:t>
+                    <w:t>${riskVerifiedBy}</w:t>
                   </w:r>
                 </w:p>
               </w:tc>
@@ -3258,10 +3054,6 @@
             <w:insideH w:val="single" w:sz="6" w:space="0" w:color="auto"/>
             <w:insideV w:val="single" w:sz="6" w:space="0" w:color="auto"/>
           </w:tblBorders>
-          <w:tblCellMar>
-            <w:top w:w="0" w:type="dxa"/>
-            <w:bottom w:w="0" w:type="dxa"/>
-          </w:tblCellMar>
         </w:tblPrEx>
         <w:trPr>
           <w:trHeight w:val="1006"/>
@@ -3360,21 +3152,7 @@
                     <w:rPr>
                       <w:rFonts w:ascii="Arial" w:hAnsi="Arial" w:cs="Arial"/>
                     </w:rPr>
-                    <w:t>${</w:t>
-                  </w:r>
-                  <w:proofErr w:type="spellStart"/>
-                  <w:r>
-                    <w:rPr>
-                      <w:rFonts w:ascii="Arial" w:hAnsi="Arial" w:cs="Arial"/>
-                    </w:rPr>
-                    <w:t>imsNo</w:t>
-                  </w:r>
-                  <w:proofErr w:type="spellEnd"/>
-                  <w:r>
-                    <w:rPr>
-                      <w:rFonts w:ascii="Arial" w:hAnsi="Arial" w:cs="Arial"/>
-                    </w:rPr>
-                    <w:t>}</w:t>
+                    <w:t>${imsNo}</w:t>
                   </w:r>
                 </w:p>
               </w:tc>
@@ -3453,21 +3231,7 @@
                     <w:rPr>
                       <w:rFonts w:ascii="Arial" w:hAnsi="Arial" w:cs="Arial"/>
                     </w:rPr>
-                    <w:t>${</w:t>
-                  </w:r>
-                  <w:proofErr w:type="spellStart"/>
-                  <w:r>
-                    <w:rPr>
-                      <w:rFonts w:ascii="Arial" w:hAnsi="Arial" w:cs="Arial"/>
-                    </w:rPr>
-                    <w:t>imsYes</w:t>
-                  </w:r>
-                  <w:proofErr w:type="spellEnd"/>
-                  <w:r>
-                    <w:rPr>
-                      <w:rFonts w:ascii="Arial" w:hAnsi="Arial" w:cs="Arial"/>
-                    </w:rPr>
-                    <w:t>}</w:t>
+                    <w:t>${imsYes}</w:t>
                   </w:r>
                 </w:p>
               </w:tc>
@@ -3554,15 +3318,7 @@
                     </w:rPr>
                   </w:pPr>
                   <w:r>
-                    <w:t>${</w:t>
-                  </w:r>
-                  <w:proofErr w:type="spellStart"/>
-                  <w:r>
-                    <w:t>imsDcrNo</w:t>
-                  </w:r>
-                  <w:proofErr w:type="spellEnd"/>
-                  <w:r>
-                    <w:t>}</w:t>
+                    <w:t>${imsDcrNo}</w:t>
                   </w:r>
                 </w:p>
               </w:tc>
@@ -3615,15 +3371,7 @@
                     </w:rPr>
                   </w:pPr>
                   <w:r>
-                    <w:t>${</w:t>
-                  </w:r>
-                  <w:proofErr w:type="spellStart"/>
-                  <w:r>
-                    <w:t>imsVerifiedBy</w:t>
-                  </w:r>
-                  <w:proofErr w:type="spellEnd"/>
-                  <w:r>
-                    <w:t>}</w:t>
+                    <w:t>${imsVerifiedBy}</w:t>
                   </w:r>
                 </w:p>
               </w:tc>
@@ -3658,10 +3406,6 @@
             <w:insideH w:val="single" w:sz="6" w:space="0" w:color="auto"/>
             <w:insideV w:val="single" w:sz="6" w:space="0" w:color="auto"/>
           </w:tblBorders>
-          <w:tblCellMar>
-            <w:top w:w="0" w:type="dxa"/>
-            <w:bottom w:w="0" w:type="dxa"/>
-          </w:tblCellMar>
         </w:tblPrEx>
         <w:trPr>
           <w:trHeight w:val="197"/>
@@ -3862,12 +3606,6 @@
         <w:gridCol w:w="10462"/>
       </w:tblGrid>
       <w:tr>
-        <w:tblPrEx>
-          <w:tblCellMar>
-            <w:top w:w="0" w:type="dxa"/>
-            <w:bottom w:w="0" w:type="dxa"/>
-          </w:tblCellMar>
-        </w:tblPrEx>
         <w:tc>
           <w:tcPr>
             <w:tcW w:w="10462" w:type="dxa"/>
@@ -6517,12 +6255,6 @@
         </w:tc>
       </w:tr>
       <w:tr>
-        <w:tblPrEx>
-          <w:tblCellMar>
-            <w:top w:w="0" w:type="dxa"/>
-            <w:bottom w:w="0" w:type="dxa"/>
-          </w:tblCellMar>
-        </w:tblPrEx>
         <w:tc>
           <w:tcPr>
             <w:tcW w:w="10462" w:type="dxa"/>
@@ -6571,15 +6303,7 @@
               </w:rPr>
             </w:pPr>
             <w:r>
-              <w:t>${</w:t>
-            </w:r>
-            <w:proofErr w:type="spellStart"/>
-            <w:r>
-              <w:t>caseClosed</w:t>
-            </w:r>
-            <w:proofErr w:type="spellEnd"/>
-            <w:r>
-              <w:t>}</w:t>
+              <w:t>${caseClosed}</w:t>
             </w:r>
           </w:p>
           <w:p>
@@ -6641,21 +6365,7 @@
                     <w:rPr>
                       <w:rFonts w:ascii="Arial" w:hAnsi="Arial" w:cs="Arial"/>
                     </w:rPr>
-                    <w:t>${</w:t>
-                  </w:r>
-                  <w:proofErr w:type="spellStart"/>
-                  <w:r>
-                    <w:rPr>
-                      <w:rFonts w:ascii="Arial" w:hAnsi="Arial" w:cs="Arial"/>
-                    </w:rPr>
-                    <w:t>imrSig</w:t>
-                  </w:r>
-                  <w:proofErr w:type="spellEnd"/>
-                  <w:r>
-                    <w:rPr>
-                      <w:rFonts w:ascii="Arial" w:hAnsi="Arial" w:cs="Arial"/>
-                    </w:rPr>
-                    <w:t>}</w:t>
+                    <w:t>${imrSig}</w:t>
                   </w:r>
                 </w:p>
               </w:tc>
@@ -6700,21 +6410,7 @@
                     <w:rPr>
                       <w:rFonts w:ascii="Arial" w:hAnsi="Arial" w:cs="Arial"/>
                     </w:rPr>
-                    <w:t>${</w:t>
-                  </w:r>
-                  <w:proofErr w:type="spellStart"/>
-                  <w:r>
-                    <w:rPr>
-                      <w:rFonts w:ascii="Arial" w:hAnsi="Arial" w:cs="Arial"/>
-                    </w:rPr>
-                    <w:t>caseClosedDate</w:t>
-                  </w:r>
-                  <w:proofErr w:type="spellEnd"/>
-                  <w:r>
-                    <w:rPr>
-                      <w:rFonts w:ascii="Arial" w:hAnsi="Arial" w:cs="Arial"/>
-                    </w:rPr>
-                    <w:t>}</w:t>
+                    <w:t>${caseClosedDate}</w:t>
                   </w:r>
                 </w:p>
               </w:tc>
@@ -6760,21 +6456,7 @@
                     <w:rPr>
                       <w:rFonts w:ascii="Arial" w:hAnsi="Arial" w:cs="Arial"/>
                     </w:rPr>
-                    <w:t>${</w:t>
-                  </w:r>
-                  <w:proofErr w:type="spellStart"/>
-                  <w:r>
-                    <w:rPr>
-                      <w:rFonts w:ascii="Arial" w:hAnsi="Arial" w:cs="Arial"/>
-                    </w:rPr>
-                    <w:t>deptHeadNotedBy</w:t>
-                  </w:r>
-                  <w:proofErr w:type="spellEnd"/>
-                  <w:r>
-                    <w:rPr>
-                      <w:rFonts w:ascii="Arial" w:hAnsi="Arial" w:cs="Arial"/>
-                    </w:rPr>
-                    <w:t>}</w:t>
+                    <w:t>${deptHeadNotedBy}</w:t>
                   </w:r>
                 </w:p>
               </w:tc>
@@ -6878,12 +6560,6 @@
         <w:gridCol w:w="2663"/>
       </w:tblGrid>
       <w:tr>
-        <w:tblPrEx>
-          <w:tblCellMar>
-            <w:top w:w="0" w:type="dxa"/>
-            <w:bottom w:w="0" w:type="dxa"/>
-          </w:tblCellMar>
-        </w:tblPrEx>
         <w:trPr>
           <w:trHeight w:val="101"/>
         </w:trPr>
@@ -6921,12 +6597,6 @@
         </w:tc>
       </w:tr>
       <w:tr>
-        <w:tblPrEx>
-          <w:tblCellMar>
-            <w:top w:w="0" w:type="dxa"/>
-            <w:bottom w:w="0" w:type="dxa"/>
-          </w:tblCellMar>
-        </w:tblPrEx>
         <w:trPr>
           <w:trHeight w:val="3533"/>
         </w:trPr>
@@ -7158,21 +6828,7 @@
                           <w:rPr>
                             <w:rFonts w:ascii="Arial" w:hAnsi="Arial" w:cs="Arial"/>
                           </w:rPr>
-                          <w:t>${</w:t>
-                        </w:r>
-                        <w:proofErr w:type="spellStart"/>
-                        <w:r>
-                          <w:rPr>
-                            <w:rFonts w:ascii="Arial" w:hAnsi="Arial" w:cs="Arial"/>
-                          </w:rPr>
-                          <w:t>effectProblem</w:t>
-                        </w:r>
-                        <w:proofErr w:type="spellEnd"/>
-                        <w:r>
-                          <w:rPr>
-                            <w:rFonts w:ascii="Arial" w:hAnsi="Arial" w:cs="Arial"/>
-                          </w:rPr>
-                          <w:t>}</w:t>
+                          <w:t>${effectProblem}</w:t>
                         </w:r>
                       </w:p>
                     </w:txbxContent>
@@ -7211,12 +6867,6 @@
         </w:tc>
       </w:tr>
       <w:tr>
-        <w:tblPrEx>
-          <w:tblCellMar>
-            <w:top w:w="0" w:type="dxa"/>
-            <w:bottom w:w="0" w:type="dxa"/>
-          </w:tblCellMar>
-        </w:tblPrEx>
         <w:trPr>
           <w:trHeight w:val="65"/>
         </w:trPr>
@@ -7331,12 +6981,6 @@
         </w:tc>
       </w:tr>
       <w:tr>
-        <w:tblPrEx>
-          <w:tblCellMar>
-            <w:top w:w="0" w:type="dxa"/>
-            <w:bottom w:w="0" w:type="dxa"/>
-          </w:tblCellMar>
-        </w:tblPrEx>
         <w:trPr>
           <w:trHeight w:val="101"/>
         </w:trPr>
@@ -7357,15 +7001,7 @@
               </w:rPr>
             </w:pPr>
             <w:r>
-              <w:t>${</w:t>
-            </w:r>
-            <w:proofErr w:type="spellStart"/>
-            <w:r>
-              <w:t>causeMan</w:t>
-            </w:r>
-            <w:proofErr w:type="spellEnd"/>
-            <w:r>
-              <w:t>}</w:t>
+              <w:t>${causeMan}</w:t>
             </w:r>
           </w:p>
           <w:p>
@@ -7497,15 +7133,7 @@
               </w:rPr>
             </w:pPr>
             <w:r>
-              <w:t>${</w:t>
-            </w:r>
-            <w:proofErr w:type="spellStart"/>
-            <w:r>
-              <w:t>causeMachine</w:t>
-            </w:r>
-            <w:proofErr w:type="spellEnd"/>
-            <w:r>
-              <w:t>}</w:t>
+              <w:t>${causeMachine}</w:t>
             </w:r>
           </w:p>
         </w:tc>
@@ -7526,15 +7154,7 @@
               </w:rPr>
             </w:pPr>
             <w:r>
-              <w:t>${</w:t>
-            </w:r>
-            <w:proofErr w:type="spellStart"/>
-            <w:r>
-              <w:t>causeMaterial</w:t>
-            </w:r>
-            <w:proofErr w:type="spellEnd"/>
-            <w:r>
-              <w:t>}</w:t>
+              <w:t>${causeMaterial}</w:t>
             </w:r>
           </w:p>
         </w:tc>
@@ -7555,15 +7175,7 @@
               </w:rPr>
             </w:pPr>
             <w:r>
-              <w:t>${</w:t>
-            </w:r>
-            <w:proofErr w:type="spellStart"/>
-            <w:r>
-              <w:t>causeMethod</w:t>
-            </w:r>
-            <w:proofErr w:type="spellEnd"/>
-            <w:r>
-              <w:t>}</w:t>
+              <w:t>${causeMethod}</w:t>
             </w:r>
           </w:p>
           <w:p>
@@ -7618,12 +7230,6 @@
         </w:tc>
       </w:tr>
       <w:tr>
-        <w:tblPrEx>
-          <w:tblCellMar>
-            <w:top w:w="0" w:type="dxa"/>
-            <w:bottom w:w="0" w:type="dxa"/>
-          </w:tblCellMar>
-        </w:tblPrEx>
         <w:trPr>
           <w:trHeight w:val="559"/>
         </w:trPr>
@@ -7678,15 +7284,7 @@
               </w:rPr>
             </w:pPr>
             <w:r>
-              <w:t>${</w:t>
-            </w:r>
-            <w:proofErr w:type="spellStart"/>
-            <w:r>
-              <w:t>causeOthers</w:t>
-            </w:r>
-            <w:proofErr w:type="spellEnd"/>
-            <w:r>
-              <w:t>}</w:t>
+              <w:t>${causeOthers}</w:t>
             </w:r>
           </w:p>
           <w:p>
@@ -7712,12 +7310,6 @@
         </w:tc>
       </w:tr>
       <w:tr>
-        <w:tblPrEx>
-          <w:tblCellMar>
-            <w:top w:w="0" w:type="dxa"/>
-            <w:bottom w:w="0" w:type="dxa"/>
-          </w:tblCellMar>
-        </w:tblPrEx>
         <w:trPr>
           <w:trHeight w:val="337"/>
         </w:trPr>
@@ -9684,6 +9276,50 @@
     <w:lsdException w:name="Subtitle" w:qFormat="1"/>
     <w:lsdException w:name="Strong" w:qFormat="1"/>
     <w:lsdException w:name="Emphasis" w:qFormat="1"/>
+    <w:lsdException w:name="Normal Table" w:semiHidden="1" w:unhideWhenUsed="1"/>
+    <w:lsdException w:name="Table Simple 1" w:semiHidden="1" w:unhideWhenUsed="1"/>
+    <w:lsdException w:name="Table Simple 2" w:semiHidden="1" w:unhideWhenUsed="1"/>
+    <w:lsdException w:name="Table Simple 3" w:semiHidden="1" w:unhideWhenUsed="1"/>
+    <w:lsdException w:name="Table Classic 1" w:semiHidden="1" w:unhideWhenUsed="1"/>
+    <w:lsdException w:name="Table Classic 2" w:semiHidden="1" w:unhideWhenUsed="1"/>
+    <w:lsdException w:name="Table Classic 3" w:semiHidden="1" w:unhideWhenUsed="1"/>
+    <w:lsdException w:name="Table Classic 4" w:semiHidden="1" w:unhideWhenUsed="1"/>
+    <w:lsdException w:name="Table Colorful 1" w:semiHidden="1" w:unhideWhenUsed="1"/>
+    <w:lsdException w:name="Table Colorful 2" w:semiHidden="1" w:unhideWhenUsed="1"/>
+    <w:lsdException w:name="Table Colorful 3" w:semiHidden="1" w:unhideWhenUsed="1"/>
+    <w:lsdException w:name="Table Columns 1" w:semiHidden="1" w:unhideWhenUsed="1"/>
+    <w:lsdException w:name="Table Columns 2" w:semiHidden="1" w:unhideWhenUsed="1"/>
+    <w:lsdException w:name="Table Columns 3" w:semiHidden="1" w:unhideWhenUsed="1"/>
+    <w:lsdException w:name="Table Columns 4" w:semiHidden="1" w:unhideWhenUsed="1"/>
+    <w:lsdException w:name="Table Columns 5" w:semiHidden="1" w:unhideWhenUsed="1"/>
+    <w:lsdException w:name="Table Grid 1" w:semiHidden="1" w:unhideWhenUsed="1"/>
+    <w:lsdException w:name="Table Grid 2" w:semiHidden="1" w:unhideWhenUsed="1"/>
+    <w:lsdException w:name="Table Grid 3" w:semiHidden="1" w:unhideWhenUsed="1"/>
+    <w:lsdException w:name="Table Grid 4" w:semiHidden="1" w:unhideWhenUsed="1"/>
+    <w:lsdException w:name="Table Grid 5" w:semiHidden="1" w:unhideWhenUsed="1"/>
+    <w:lsdException w:name="Table Grid 6" w:semiHidden="1" w:unhideWhenUsed="1"/>
+    <w:lsdException w:name="Table Grid 7" w:semiHidden="1" w:unhideWhenUsed="1"/>
+    <w:lsdException w:name="Table Grid 8" w:semiHidden="1" w:unhideWhenUsed="1"/>
+    <w:lsdException w:name="Table List 1" w:semiHidden="1" w:unhideWhenUsed="1"/>
+    <w:lsdException w:name="Table List 2" w:semiHidden="1" w:unhideWhenUsed="1"/>
+    <w:lsdException w:name="Table List 3" w:semiHidden="1" w:unhideWhenUsed="1"/>
+    <w:lsdException w:name="Table List 4" w:semiHidden="1" w:unhideWhenUsed="1"/>
+    <w:lsdException w:name="Table List 5" w:semiHidden="1" w:unhideWhenUsed="1"/>
+    <w:lsdException w:name="Table List 6" w:semiHidden="1" w:unhideWhenUsed="1"/>
+    <w:lsdException w:name="Table List 7" w:semiHidden="1" w:unhideWhenUsed="1"/>
+    <w:lsdException w:name="Table List 8" w:semiHidden="1" w:unhideWhenUsed="1"/>
+    <w:lsdException w:name="Table 3D effects 1" w:semiHidden="1" w:unhideWhenUsed="1"/>
+    <w:lsdException w:name="Table 3D effects 2" w:semiHidden="1" w:unhideWhenUsed="1"/>
+    <w:lsdException w:name="Table 3D effects 3" w:semiHidden="1" w:unhideWhenUsed="1"/>
+    <w:lsdException w:name="Table Contemporary" w:semiHidden="1" w:unhideWhenUsed="1"/>
+    <w:lsdException w:name="Table Elegant" w:semiHidden="1" w:unhideWhenUsed="1"/>
+    <w:lsdException w:name="Table Professional" w:semiHidden="1" w:unhideWhenUsed="1"/>
+    <w:lsdException w:name="Table Subtle 1" w:semiHidden="1" w:unhideWhenUsed="1"/>
+    <w:lsdException w:name="Table Subtle 2" w:semiHidden="1" w:unhideWhenUsed="1"/>
+    <w:lsdException w:name="Table Web 1" w:semiHidden="1" w:unhideWhenUsed="1"/>
+    <w:lsdException w:name="Table Web 2" w:semiHidden="1" w:unhideWhenUsed="1"/>
+    <w:lsdException w:name="Table Web 3" w:semiHidden="1" w:unhideWhenUsed="1"/>
+    <w:lsdException w:name="Table Theme" w:semiHidden="1" w:unhideWhenUsed="1"/>
     <w:lsdException w:name="Placeholder Text" w:semiHidden="1" w:uiPriority="99" w:unhideWhenUsed="1"/>
     <w:lsdException w:name="No Spacing" w:uiPriority="99" w:qFormat="1"/>
     <w:lsdException w:name="Light Shading" w:uiPriority="99"/>
@@ -9803,7 +9439,7 @@
     <w:lsdException w:name="Grid Table Light" w:uiPriority="68" w:qFormat="1"/>
     <w:lsdException w:name="Grid Table 1 Light" w:uiPriority="69" w:qFormat="1"/>
     <w:lsdException w:name="Grid Table 2" w:uiPriority="70"/>
-    <w:lsdException w:name="Grid Table 3" w:semiHidden="1" w:uiPriority="71" w:unhideWhenUsed="1" w:qFormat="1"/>
+    <w:lsdException w:name="Grid Table 3" w:uiPriority="71" w:qFormat="1"/>
     <w:lsdException w:name="Grid Table 4" w:uiPriority="41"/>
     <w:lsdException w:name="Grid Table 5 Dark" w:uiPriority="42"/>
     <w:lsdException w:name="Grid Table 6 Colorful" w:uiPriority="43"/>
@@ -9975,11 +9611,15 @@
   </w:style>
   <w:style w:type="character" w:default="1" w:styleId="DefaultParagraphFont">
     <w:name w:val="Default Paragraph Font"/>
+    <w:uiPriority w:val="1"/>
     <w:semiHidden/>
+    <w:unhideWhenUsed/>
   </w:style>
   <w:style w:type="table" w:default="1" w:styleId="TableNormal">
     <w:name w:val="Normal Table"/>
+    <w:uiPriority w:val="99"/>
     <w:semiHidden/>
+    <w:unhideWhenUsed/>
     <w:tblPr>
       <w:tblInd w:w="0" w:type="dxa"/>
       <w:tblCellMar>
@@ -9995,7 +9635,9 @@
   </w:style>
   <w:style w:type="numbering" w:default="1" w:styleId="NoList">
     <w:name w:val="No List"/>
+    <w:uiPriority w:val="99"/>
     <w:semiHidden/>
+    <w:unhideWhenUsed/>
   </w:style>
   <w:style w:type="paragraph" w:styleId="Header">
     <w:name w:val="header"/>

</xml_diff>